<commit_message>
add risks to document template
</commit_message>
<xml_diff>
--- a/public/projectplan_template.docx
+++ b/public/projectplan_template.docx
@@ -2950,6 +2950,11 @@
       </w:r>
     </w:p>
     <w:p>
+      <w:r>
+        <w:t>Ownership: see building permit.</w:t>
+      </w:r>
+    </w:p>
+    <w:p>
       <w:pPr>
         <w:pStyle w:val="Kop2"/>
       </w:pPr>
@@ -3931,6 +3936,20 @@
         <w:spacing w:before="240" w:after="240"/>
         <w:rPr>
           <w:i/>
+        </w:rPr>
+      </w:pPr>
+      <w:r>
+        <w:rPr>
+          <w:i/>
+        </w:rPr>
+        <w:t>Yes, see epd link.</w:t>
+      </w:r>
+    </w:p>
+    <w:p>
+      <w:pPr>
+        <w:spacing w:before="240" w:after="240"/>
+        <w:rPr>
+          <w:i/>
           <w:highlight w:val="yellow"/>
         </w:rPr>
       </w:pPr>
@@ -4035,6 +4054,17 @@
     <w:p>
       <w:pPr>
         <w:spacing w:before="240" w:after="240"/>
+      </w:pPr>
+      <w:r>
+        <w:t>Complies with building cod</w:t>
+      </w:r>
+      <w:r>
+        <w:t>e</w:t>
+      </w:r>
+    </w:p>
+    <w:p>
+      <w:pPr>
+        <w:spacing w:before="240" w:after="240"/>
         <w:rPr>
           <w:highlight w:val="yellow"/>
         </w:rPr>
@@ -4043,6 +4073,7 @@
         <w:rPr>
           <w:highlight w:val="yellow"/>
         </w:rPr>
+        <w:lastRenderedPageBreak/>
         <w:t>{sustAdaptationMin}</w:t>
       </w:r>
     </w:p>
@@ -4075,8 +4106,15 @@
         <w:rPr>
           <w:i/>
         </w:rPr>
-        <w:lastRenderedPageBreak/>
         <w:t>Sustainable Use and Protection of Water and Marine Resources</w:t>
+      </w:r>
+    </w:p>
+    <w:p>
+      <w:pPr>
+        <w:spacing w:before="240" w:after="240"/>
+      </w:pPr>
+      <w:r>
+        <w:t>Complies with building code</w:t>
       </w:r>
     </w:p>
     <w:p>
@@ -4128,6 +4166,14 @@
     <w:p>
       <w:pPr>
         <w:spacing w:before="240" w:after="240"/>
+      </w:pPr>
+      <w:r>
+        <w:t>Complies with building code</w:t>
+      </w:r>
+    </w:p>
+    <w:p>
+      <w:pPr>
+        <w:spacing w:before="240" w:after="240"/>
         <w:rPr>
           <w:highlight w:val="yellow"/>
         </w:rPr>
@@ -4179,6 +4225,17 @@
         </w:rPr>
       </w:pPr>
       <w:r>
+        <w:t>Complies with building code</w:t>
+      </w:r>
+    </w:p>
+    <w:p>
+      <w:pPr>
+        <w:spacing w:before="240" w:after="240"/>
+        <w:rPr>
+          <w:highlight w:val="yellow"/>
+        </w:rPr>
+      </w:pPr>
+      <w:r>
         <w:rPr>
           <w:highlight w:val="yellow"/>
         </w:rPr>
@@ -4215,6 +4272,22 @@
           <w:i/>
         </w:rPr>
         <w:t>Protection and Restoration of Biodiversity and Ecosystems</w:t>
+      </w:r>
+    </w:p>
+    <w:p>
+      <w:pPr>
+        <w:spacing w:before="240" w:after="240"/>
+        <w:rPr>
+          <w:i/>
+        </w:rPr>
+      </w:pPr>
+    </w:p>
+    <w:p>
+      <w:pPr>
+        <w:spacing w:before="240" w:after="240"/>
+      </w:pPr>
+      <w:r>
+        <w:t>Complies with building code</w:t>
       </w:r>
     </w:p>
     <w:p>

</xml_diff>